<commit_message>
Avance del proyecto semana 3
</commit_message>
<xml_diff>
--- a/Bitacora.docx
+++ b/Bitacora.docx
@@ -255,7 +255,7 @@
           <w:noProof/>
         </w:rPr>
         <w:drawing>
-          <wp:anchor distT="0" distB="0" distL="114300" distR="114300" simplePos="0" relativeHeight="251660288" behindDoc="0" locked="0" layoutInCell="1" allowOverlap="1" wp14:anchorId="575E255D" wp14:editId="708C5419">
+          <wp:anchor distT="0" distB="0" distL="114300" distR="114300" simplePos="0" relativeHeight="251660288" behindDoc="0" locked="0" layoutInCell="1" allowOverlap="1" wp14:anchorId="575E255D" wp14:editId="467CB110">
             <wp:simplePos x="0" y="0"/>
             <wp:positionH relativeFrom="page">
               <wp:posOffset>304800</wp:posOffset>
@@ -523,25 +523,7 @@
           <w:sz w:val="36"/>
           <w:szCs w:val="36"/>
         </w:rPr>
-        <w:t xml:space="preserve">6 de </w:t>
-      </w:r>
-      <w:proofErr w:type="gramStart"/>
-      <w:r>
-        <w:rPr>
-          <w:rFonts w:ascii="Georgia Pro Cond Light" w:hAnsi="Georgia Pro Cond Light"/>
-          <w:sz w:val="36"/>
-          <w:szCs w:val="36"/>
-        </w:rPr>
-        <w:t>Octubre</w:t>
-      </w:r>
-      <w:proofErr w:type="gramEnd"/>
-      <w:r>
-        <w:rPr>
-          <w:rFonts w:ascii="Georgia Pro Cond Light" w:hAnsi="Georgia Pro Cond Light"/>
-          <w:sz w:val="36"/>
-          <w:szCs w:val="36"/>
-        </w:rPr>
-        <w:t xml:space="preserve"> 2026</w:t>
+        <w:t>6 de Octubre 2026</w:t>
       </w:r>
     </w:p>
     <w:p>
@@ -610,44 +592,14 @@
           <w:rFonts w:ascii="Arial" w:hAnsi="Arial" w:cs="Arial"/>
         </w:rPr>
         <w:lastRenderedPageBreak/>
-        <w:t xml:space="preserve">El día 7 de octubre se le pregunta a </w:t>
-      </w:r>
-      <w:proofErr w:type="spellStart"/>
-      <w:r>
-        <w:rPr>
-          <w:rFonts w:ascii="Arial" w:hAnsi="Arial" w:cs="Arial"/>
-        </w:rPr>
-        <w:t>chatgpt</w:t>
-      </w:r>
-      <w:proofErr w:type="spellEnd"/>
-      <w:r>
-        <w:rPr>
-          <w:rFonts w:ascii="Arial" w:hAnsi="Arial" w:cs="Arial"/>
-        </w:rPr>
-        <w:t xml:space="preserve"> sobre la conexión de </w:t>
-      </w:r>
-      <w:proofErr w:type="spellStart"/>
-      <w:r>
-        <w:rPr>
-          <w:rFonts w:ascii="Arial" w:hAnsi="Arial" w:cs="Arial"/>
-        </w:rPr>
-        <w:t>Github</w:t>
-      </w:r>
-      <w:proofErr w:type="spellEnd"/>
-      <w:r>
-        <w:rPr>
-          <w:rFonts w:ascii="Arial" w:hAnsi="Arial" w:cs="Arial"/>
-        </w:rPr>
-        <w:t xml:space="preserve"> con </w:t>
-      </w:r>
-      <w:proofErr w:type="spellStart"/>
+        <w:t xml:space="preserve">El día 7 de octubre se le pregunta a chatgpt sobre la conexión de Github con </w:t>
+      </w:r>
       <w:r>
         <w:rPr>
           <w:rFonts w:ascii="Arial" w:hAnsi="Arial" w:cs="Arial"/>
         </w:rPr>
         <w:t>intellij</w:t>
       </w:r>
-      <w:proofErr w:type="spellEnd"/>
       <w:r>
         <w:rPr>
           <w:rFonts w:ascii="Arial" w:hAnsi="Arial" w:cs="Arial"/>
@@ -667,14 +619,242 @@
           <w:rFonts w:ascii="Arial" w:hAnsi="Arial" w:cs="Arial"/>
         </w:rPr>
       </w:pPr>
-    </w:p>
-    <w:p>
-      <w:pPr>
+      <w:r>
+        <w:rPr>
+          <w:rFonts w:ascii="Arial" w:hAnsi="Arial" w:cs="Arial"/>
+        </w:rPr>
+        <w:t xml:space="preserve">Se consulto comandos para la instalación de Mvn. </w:t>
+      </w:r>
+    </w:p>
+    <w:p>
+      <w:pPr>
+        <w:pStyle w:val="Prrafodelista"/>
+        <w:numPr>
+          <w:ilvl w:val="0"/>
+          <w:numId w:val="5"/>
+        </w:numPr>
         <w:jc w:val="both"/>
         <w:rPr>
           <w:rFonts w:ascii="Arial" w:hAnsi="Arial" w:cs="Arial"/>
         </w:rPr>
       </w:pPr>
+      <w:r>
+        <w:rPr>
+          <w:rFonts w:ascii="Arial" w:hAnsi="Arial" w:cs="Arial"/>
+        </w:rPr>
+        <w:t xml:space="preserve">Se consultó comandos para subir a github el proyecto. </w:t>
+      </w:r>
+    </w:p>
+    <w:p>
+      <w:pPr>
+        <w:pStyle w:val="Prrafodelista"/>
+        <w:numPr>
+          <w:ilvl w:val="0"/>
+          <w:numId w:val="5"/>
+        </w:numPr>
+        <w:jc w:val="both"/>
+        <w:rPr>
+          <w:rFonts w:ascii="Arial" w:hAnsi="Arial" w:cs="Arial"/>
+        </w:rPr>
+      </w:pPr>
+      <w:r>
+        <w:rPr>
+          <w:rFonts w:ascii="Arial" w:hAnsi="Arial" w:cs="Arial"/>
+        </w:rPr>
+        <w:t>G</w:t>
+      </w:r>
+      <w:r>
+        <w:rPr>
+          <w:rFonts w:ascii="Arial" w:hAnsi="Arial" w:cs="Arial"/>
+        </w:rPr>
+        <w:t>uía de implementación de dato</w:t>
+      </w:r>
+      <w:r>
+        <w:rPr>
+          <w:rFonts w:ascii="Arial" w:hAnsi="Arial" w:cs="Arial"/>
+        </w:rPr>
+        <w:t>s.</w:t>
+      </w:r>
+    </w:p>
+    <w:p>
+      <w:pPr>
+        <w:pStyle w:val="Prrafodelista"/>
+        <w:numPr>
+          <w:ilvl w:val="0"/>
+          <w:numId w:val="5"/>
+        </w:numPr>
+        <w:jc w:val="both"/>
+        <w:rPr>
+          <w:rFonts w:ascii="Arial" w:hAnsi="Arial" w:cs="Arial"/>
+        </w:rPr>
+      </w:pPr>
+      <w:r>
+        <w:rPr>
+          <w:rFonts w:ascii="Arial" w:hAnsi="Arial" w:cs="Arial"/>
+        </w:rPr>
+        <w:t>Investigación sobre los Hilos en java.</w:t>
+      </w:r>
+    </w:p>
+    <w:p>
+      <w:pPr>
+        <w:pStyle w:val="Prrafodelista"/>
+        <w:numPr>
+          <w:ilvl w:val="0"/>
+          <w:numId w:val="5"/>
+        </w:numPr>
+        <w:jc w:val="both"/>
+        <w:rPr>
+          <w:rFonts w:ascii="Arial" w:hAnsi="Arial" w:cs="Arial"/>
+        </w:rPr>
+      </w:pPr>
+      <w:r>
+        <w:rPr>
+          <w:rFonts w:ascii="Arial" w:hAnsi="Arial" w:cs="Arial"/>
+        </w:rPr>
+        <w:t>Investigación sobre Template Method.</w:t>
+      </w:r>
+    </w:p>
+    <w:p>
+      <w:pPr>
+        <w:pStyle w:val="Prrafodelista"/>
+        <w:numPr>
+          <w:ilvl w:val="0"/>
+          <w:numId w:val="5"/>
+        </w:numPr>
+        <w:jc w:val="both"/>
+        <w:rPr>
+          <w:rFonts w:ascii="Arial" w:hAnsi="Arial" w:cs="Arial"/>
+        </w:rPr>
+      </w:pPr>
+      <w:r>
+        <w:rPr>
+          <w:rFonts w:ascii="Arial" w:hAnsi="Arial" w:cs="Arial"/>
+        </w:rPr>
+        <w:t xml:space="preserve">Investigación de instalación de </w:t>
+      </w:r>
+      <w:r>
+        <w:rPr>
+          <w:rFonts w:ascii="Arial" w:hAnsi="Arial" w:cs="Arial"/>
+        </w:rPr>
+        <w:t>Swing + FlatLaf</w:t>
+      </w:r>
+      <w:r>
+        <w:rPr>
+          <w:rFonts w:ascii="Arial" w:hAnsi="Arial" w:cs="Arial"/>
+        </w:rPr>
+        <w:t>.</w:t>
+      </w:r>
+    </w:p>
+    <w:p>
+      <w:pPr>
+        <w:pStyle w:val="Prrafodelista"/>
+        <w:numPr>
+          <w:ilvl w:val="0"/>
+          <w:numId w:val="5"/>
+        </w:numPr>
+        <w:jc w:val="both"/>
+        <w:rPr>
+          <w:rFonts w:ascii="Arial" w:hAnsi="Arial" w:cs="Arial"/>
+        </w:rPr>
+      </w:pPr>
+      <w:r>
+        <w:rPr>
+          <w:rFonts w:ascii="Arial" w:hAnsi="Arial" w:cs="Arial"/>
+        </w:rPr>
+        <w:t>Se investigó sobre de</w:t>
+      </w:r>
+      <w:r>
+        <w:rPr>
+          <w:rFonts w:ascii="Arial" w:hAnsi="Arial" w:cs="Arial"/>
+        </w:rPr>
+        <w:t xml:space="preserve"> </w:t>
+      </w:r>
+      <w:r>
+        <w:rPr>
+          <w:rFonts w:ascii="Arial" w:hAnsi="Arial" w:cs="Arial"/>
+        </w:rPr>
+        <w:t>Swing + FlatLaf</w:t>
+      </w:r>
+      <w:r>
+        <w:rPr>
+          <w:rFonts w:ascii="Arial" w:hAnsi="Arial" w:cs="Arial"/>
+        </w:rPr>
+        <w:t xml:space="preserve"> c</w:t>
+      </w:r>
+      <w:r>
+        <w:rPr>
+          <w:rFonts w:ascii="Arial" w:hAnsi="Arial" w:cs="Arial"/>
+        </w:rPr>
+        <w:t xml:space="preserve">ompilación y </w:t>
+      </w:r>
+      <w:r>
+        <w:rPr>
+          <w:rFonts w:ascii="Arial" w:hAnsi="Arial" w:cs="Arial"/>
+        </w:rPr>
+        <w:t>e</w:t>
+      </w:r>
+      <w:r>
+        <w:rPr>
+          <w:rFonts w:ascii="Arial" w:hAnsi="Arial" w:cs="Arial"/>
+        </w:rPr>
+        <w:t>jecución</w:t>
+      </w:r>
+      <w:r>
+        <w:rPr>
+          <w:rFonts w:ascii="Arial" w:hAnsi="Arial" w:cs="Arial"/>
+        </w:rPr>
+        <w:t xml:space="preserve"> porque daba</w:t>
+      </w:r>
+      <w:r>
+        <w:rPr>
+          <w:rFonts w:ascii="Arial" w:hAnsi="Arial" w:cs="Arial"/>
+        </w:rPr>
+        <w:t xml:space="preserve"> sale error al compilar con FlatLaf desde la terminal de comandos de PowerShell</w:t>
+      </w:r>
+      <w:r>
+        <w:rPr>
+          <w:rFonts w:ascii="Arial" w:hAnsi="Arial" w:cs="Arial"/>
+        </w:rPr>
+        <w:t>.</w:t>
+      </w:r>
+    </w:p>
+    <w:p>
+      <w:pPr>
+        <w:pStyle w:val="Prrafodelista"/>
+        <w:numPr>
+          <w:ilvl w:val="0"/>
+          <w:numId w:val="5"/>
+        </w:numPr>
+        <w:jc w:val="both"/>
+        <w:rPr>
+          <w:rFonts w:ascii="Arial" w:hAnsi="Arial" w:cs="Arial"/>
+        </w:rPr>
+      </w:pPr>
+      <w:r>
+        <w:rPr>
+          <w:rFonts w:ascii="Arial" w:hAnsi="Arial" w:cs="Arial"/>
+        </w:rPr>
+        <w:t>Utilice la IA como herramienta de consulta para base de datos.</w:t>
+      </w:r>
+    </w:p>
+    <w:p>
+      <w:pPr>
+        <w:pStyle w:val="Prrafodelista"/>
+        <w:numPr>
+          <w:ilvl w:val="0"/>
+          <w:numId w:val="5"/>
+        </w:numPr>
+        <w:jc w:val="both"/>
+        <w:rPr>
+          <w:rFonts w:ascii="Arial" w:hAnsi="Arial" w:cs="Arial"/>
+        </w:rPr>
+      </w:pPr>
+      <w:r>
+        <w:rPr>
+          <w:rFonts w:ascii="Arial" w:hAnsi="Arial" w:cs="Arial"/>
+        </w:rPr>
+        <w:t>Documentación de Javadoc.</w:t>
+      </w:r>
     </w:p>
     <w:p>
       <w:pPr>

</xml_diff>